<commit_message>
Update DPI log DNS fields in Grism_syslog_fields.docx
Add opcode, update_op, record, rcode fields; remove dtype_num field.

Co-Authored-By: Claude Sonnet 4.6 <noreply@anthropic.com>
</commit_message>
<xml_diff>
--- a/docs/Grism_syslog_fields.docx
+++ b/docs/Grism_syslog_fields.docx
@@ -1183,6 +1183,107 @@
             <w:proofErr w:type="spellStart"/>
             <w:r>
               <w:t>dnslog</w:t>
+            </w:r>
+            <w:proofErr w:type="spellEnd"/>
+          </w:p>
+        </w:tc>
+      </w:tr>
+      <w:tr>
+        <w:trPr>
+          <w:trHeight w:val="353"/>
+        </w:trPr>
+        <w:tc>
+          <w:tcPr>
+            <w:tcW w:w="0" w:type="auto"/>
+            <w:tcBorders>
+              <w:top w:val="single" w:sz="8" w:space="0" w:color="000000"/>
+              <w:left w:val="single" w:sz="8" w:space="0" w:color="000000"/>
+              <w:bottom w:val="single" w:sz="8" w:space="0" w:color="000000"/>
+              <w:right w:val="single" w:sz="8" w:space="0" w:color="000000"/>
+            </w:tcBorders>
+            <w:tcMar>
+              <w:top w:w="100" w:type="dxa"/>
+              <w:left w:w="100" w:type="dxa"/>
+              <w:bottom w:w="100" w:type="dxa"/>
+              <w:right w:w="100" w:type="dxa"/>
+            </w:tcMar>
+          </w:tcPr>
+          <w:p>
+            <w:r>
+              <w:t>0.9</w:t>
+            </w:r>
+          </w:p>
+        </w:tc>
+        <w:tc>
+          <w:tcPr>
+            <w:tcW w:w="0" w:type="auto"/>
+            <w:tcBorders>
+              <w:top w:val="single" w:sz="8" w:space="0" w:color="000000"/>
+              <w:left w:val="single" w:sz="8" w:space="0" w:color="000000"/>
+              <w:bottom w:val="single" w:sz="8" w:space="0" w:color="000000"/>
+              <w:right w:val="single" w:sz="8" w:space="0" w:color="000000"/>
+            </w:tcBorders>
+            <w:tcMar>
+              <w:top w:w="100" w:type="dxa"/>
+              <w:left w:w="100" w:type="dxa"/>
+              <w:bottom w:w="100" w:type="dxa"/>
+              <w:right w:w="100" w:type="dxa"/>
+            </w:tcMar>
+          </w:tcPr>
+          <w:p>
+            <w:r>
+              <w:t>2026/05/19</w:t>
+            </w:r>
+          </w:p>
+        </w:tc>
+        <w:tc>
+          <w:tcPr>
+            <w:tcW w:w="0" w:type="auto"/>
+            <w:tcBorders>
+              <w:top w:val="single" w:sz="8" w:space="0" w:color="000000"/>
+              <w:left w:val="single" w:sz="8" w:space="0" w:color="000000"/>
+              <w:bottom w:val="single" w:sz="8" w:space="0" w:color="000000"/>
+              <w:right w:val="single" w:sz="8" w:space="0" w:color="000000"/>
+            </w:tcBorders>
+            <w:tcMar>
+              <w:top w:w="100" w:type="dxa"/>
+              <w:left w:w="100" w:type="dxa"/>
+              <w:bottom w:w="100" w:type="dxa"/>
+              <w:right w:w="100" w:type="dxa"/>
+            </w:tcMar>
+          </w:tcPr>
+          <w:p>
+            <w:r>
+              <w:t>Jay</w:t>
+            </w:r>
+          </w:p>
+        </w:tc>
+        <w:tc>
+          <w:tcPr>
+            <w:tcW w:w="0" w:type="auto"/>
+            <w:tcBorders>
+              <w:top w:val="single" w:sz="8" w:space="0" w:color="000000"/>
+              <w:left w:val="single" w:sz="8" w:space="0" w:color="000000"/>
+              <w:bottom w:val="single" w:sz="8" w:space="0" w:color="000000"/>
+              <w:right w:val="single" w:sz="8" w:space="0" w:color="000000"/>
+            </w:tcBorders>
+            <w:tcMar>
+              <w:top w:w="100" w:type="dxa"/>
+              <w:left w:w="100" w:type="dxa"/>
+              <w:bottom w:w="100" w:type="dxa"/>
+              <w:right w:w="100" w:type="dxa"/>
+            </w:tcMar>
+          </w:tcPr>
+          <w:p>
+            <w:r>
+              <w:rPr>
+                <w:rFonts w:hint="eastAsia"/>
+              </w:rPr>
+              <w:t>新增dnslog opcode, update_op, record, rcode欄位，移除dtype_num欄位</w:t>
+            </w:r>
+            <w:proofErr w:type="spellStart"/>
+            <w:r>
+              <w:t/>
             </w:r>
             <w:proofErr w:type="spellEnd"/>
           </w:p>
@@ -4610,12 +4711,12 @@
     </w:p>
     <w:p>
       <w:r>
-        <w:t>datetime=2026-01-26 06:11:59,type=4,client=192.168.1.217,server=8.8.8.8,client_port=58356,server_port=53,class=IN,domain=www.google.com,flag_qr=0,dtype=A,dtype_num=1,inport=P1</w:t>
+        <w:t>datetime=2026-01-26 06:11:59,type=4,client=192.168.1.217,server=8.8.8.8,client_port=58356,server_port=53,class=IN,domain=www.google.com,flag_qr=0,dtype=A,inport=P1</w:t>
       </w:r>
     </w:p>
     <w:p>
       <w:r>
-        <w:t>datetime=2026-01-26 06:11:59,type=4,client=192.168.1.217,server=8.8.8.8,client_port=58356,server_port=53,class=IN,domain=www.google.com,flag_qr=1,dtype=A,dtype_num=1,answer=142.250.77.4,ttl=201,inport=P1</w:t>
+        <w:t>datetime=2026-01-26 06:11:59,type=4,client=192.168.1.217,server=8.8.8.8,client_port=58356,server_port=53,class=IN,domain=www.google.com,flag_qr=1,dtype=A,answer=142.250.77.4,ttl=201,inport=P1</w:t>
       </w:r>
     </w:p>
     <w:tbl>
@@ -5372,7 +5473,10 @@
           <w:p>
             <w:proofErr w:type="spellStart"/>
             <w:r>
-              <w:t>dtype_num</w:t>
+              <w:rPr>
+                <w:rFonts w:hint="eastAsia"/>
+              </w:rPr>
+              <w:t>opcode</w:t>
             </w:r>
             <w:proofErr w:type="spellEnd"/>
           </w:p>
@@ -5384,28 +5488,28 @@
           <w:p>
             <w:proofErr w:type="spellStart"/>
             <w:r>
-              <w:rPr>
-                <w:rFonts w:hint="eastAsia"/>
-              </w:rPr>
-              <w:t>Dn</w:t>
-            </w:r>
-            <w:r>
-              <w:t>s</w:t>
-            </w:r>
-            <w:proofErr w:type="spellEnd"/>
-            <w:r>
-              <w:t xml:space="preserve"> </w:t>
-            </w:r>
-            <w:proofErr w:type="spellStart"/>
-            <w:r>
-              <w:t>d</w:t>
-            </w:r>
-            <w:r>
-              <w:t>type</w:t>
-            </w:r>
-            <w:proofErr w:type="spellEnd"/>
-            <w:r>
-              <w:t xml:space="preserve"> num</w:t>
+              <w:t>Dns opcode field</w:t>
+            </w:r>
+            <w:r>
+              <w:rPr>
+                <w:rFonts w:hint="eastAsia"/>
+              </w:rPr>
+              <w:t/>
+            </w:r>
+            <w:proofErr w:type="spellEnd"/>
+            <w:r>
+              <w:rPr>
+                <w:rFonts w:hint="eastAsia"/>
+              </w:rPr>
+              <w:t xml:space="preserve"/>
+            </w:r>
+            <w:proofErr w:type="spellStart"/>
+            <w:r>
+              <w:t/>
+            </w:r>
+            <w:proofErr w:type="spellEnd"/>
+            <w:r>
+              <w:t xml:space="preserve"/>
             </w:r>
           </w:p>
         </w:tc>
@@ -5418,14 +5522,9 @@
               <w:rPr>
                 <w:rFonts w:hint="eastAsia"/>
               </w:rPr>
-              <w:t>E</w:t>
-            </w:r>
-            <w:r>
-              <w:t xml:space="preserve">x. </w:t>
-            </w:r>
-            <w:r>
-              <w:t>1</w:t>
-            </w:r>
+              <w:t>Ex. QUERY, IQUERY, UPDATE</w:t>
+            </w:r>
+            <w:r/>
           </w:p>
         </w:tc>
         <w:tc>
@@ -5437,10 +5536,237 @@
               <w:rPr>
                 <w:rFonts w:hint="eastAsia"/>
               </w:rPr>
-              <w:t>i</w:t>
-            </w:r>
-            <w:r>
-              <w:t>nt</w:t>
+              <w:t>string</w:t>
+            </w:r>
+          </w:p>
+        </w:tc>
+      </w:tr>
+      <w:tr>
+        <w:tc>
+          <w:tcPr>
+            <w:tcW w:w="2676" w:type="dxa"/>
+          </w:tcPr>
+          <w:p>
+            <w:proofErr w:type="spellStart"/>
+            <w:r>
+              <w:rPr>
+                <w:rFonts w:hint="eastAsia"/>
+              </w:rPr>
+              <w:t>rcode</w:t>
+            </w:r>
+            <w:proofErr w:type="spellEnd"/>
+          </w:p>
+        </w:tc>
+        <w:tc>
+          <w:tcPr>
+            <w:tcW w:w="1331" w:type="dxa"/>
+          </w:tcPr>
+          <w:p>
+            <w:proofErr w:type="spellStart"/>
+            <w:r>
+              <w:t>Dns rcode field</w:t>
+            </w:r>
+            <w:r>
+              <w:rPr>
+                <w:rFonts w:hint="eastAsia"/>
+              </w:rPr>
+              <w:t/>
+            </w:r>
+            <w:proofErr w:type="spellEnd"/>
+            <w:r>
+              <w:rPr>
+                <w:rFonts w:hint="eastAsia"/>
+              </w:rPr>
+              <w:t xml:space="preserve"/>
+            </w:r>
+            <w:proofErr w:type="spellStart"/>
+            <w:r>
+              <w:t/>
+            </w:r>
+            <w:proofErr w:type="spellEnd"/>
+            <w:r>
+              <w:t xml:space="preserve"/>
+            </w:r>
+          </w:p>
+        </w:tc>
+        <w:tc>
+          <w:tcPr>
+            <w:tcW w:w="2359" w:type="dxa"/>
+          </w:tcPr>
+          <w:p>
+            <w:r>
+              <w:rPr>
+                <w:rFonts w:hint="eastAsia"/>
+              </w:rPr>
+              <w:t>Ex. NOERROR, NXDOMAIN</w:t>
+            </w:r>
+            <w:r/>
+          </w:p>
+        </w:tc>
+        <w:tc>
+          <w:tcPr>
+            <w:tcW w:w="1930" w:type="dxa"/>
+          </w:tcPr>
+          <w:p>
+            <w:r>
+              <w:rPr>
+                <w:rFonts w:hint="eastAsia"/>
+              </w:rPr>
+              <w:t>string</w:t>
+            </w:r>
+          </w:p>
+        </w:tc>
+      </w:tr>
+      <w:tr>
+        <w:tc>
+          <w:tcPr>
+            <w:tcW w:w="2676" w:type="dxa"/>
+          </w:tcPr>
+          <w:p>
+            <w:proofErr w:type="spellStart"/>
+            <w:r>
+              <w:rPr>
+                <w:rFonts w:hint="eastAsia"/>
+              </w:rPr>
+              <w:t>update_op</w:t>
+            </w:r>
+            <w:proofErr w:type="spellEnd"/>
+          </w:p>
+        </w:tc>
+        <w:tc>
+          <w:tcPr>
+            <w:tcW w:w="1331" w:type="dxa"/>
+          </w:tcPr>
+          <w:p>
+            <w:proofErr w:type="spellStart"/>
+            <w:r>
+              <w:t>Dns update operation field</w:t>
+            </w:r>
+            <w:r>
+              <w:rPr>
+                <w:rFonts w:hint="eastAsia"/>
+              </w:rPr>
+              <w:t/>
+            </w:r>
+            <w:proofErr w:type="spellEnd"/>
+            <w:r>
+              <w:rPr>
+                <w:rFonts w:hint="eastAsia"/>
+              </w:rPr>
+              <w:t xml:space="preserve"/>
+            </w:r>
+            <w:proofErr w:type="spellStart"/>
+            <w:r>
+              <w:t/>
+            </w:r>
+            <w:proofErr w:type="spellEnd"/>
+            <w:r>
+              <w:t xml:space="preserve"/>
+            </w:r>
+          </w:p>
+        </w:tc>
+        <w:tc>
+          <w:tcPr>
+            <w:tcW w:w="2359" w:type="dxa"/>
+          </w:tcPr>
+          <w:p>
+            <w:r>
+              <w:rPr>
+                <w:rFonts w:hint="eastAsia"/>
+              </w:rPr>
+              <w:t>Ex. ADD, DELETE, DELETE_ALL</w:t>
+            </w:r>
+            <w:r/>
+          </w:p>
+        </w:tc>
+        <w:tc>
+          <w:tcPr>
+            <w:tcW w:w="1930" w:type="dxa"/>
+          </w:tcPr>
+          <w:p>
+            <w:r>
+              <w:rPr>
+                <w:rFonts w:hint="eastAsia"/>
+              </w:rPr>
+              <w:t>string</w:t>
+            </w:r>
+          </w:p>
+        </w:tc>
+      </w:tr>
+      <w:tr>
+        <w:tc>
+          <w:tcPr>
+            <w:tcW w:w="2676" w:type="dxa"/>
+          </w:tcPr>
+          <w:p>
+            <w:proofErr w:type="spellStart"/>
+            <w:r>
+              <w:rPr>
+                <w:rFonts w:hint="eastAsia"/>
+              </w:rPr>
+              <w:t>record</w:t>
+            </w:r>
+            <w:proofErr w:type="spellEnd"/>
+          </w:p>
+        </w:tc>
+        <w:tc>
+          <w:tcPr>
+            <w:tcW w:w="1331" w:type="dxa"/>
+          </w:tcPr>
+          <w:p>
+            <w:proofErr w:type="spellStart"/>
+            <w:r>
+              <w:t>Dns record field</w:t>
+            </w:r>
+            <w:r>
+              <w:rPr>
+                <w:rFonts w:hint="eastAsia"/>
+              </w:rPr>
+              <w:t/>
+            </w:r>
+            <w:proofErr w:type="spellEnd"/>
+            <w:r>
+              <w:rPr>
+                <w:rFonts w:hint="eastAsia"/>
+              </w:rPr>
+              <w:t xml:space="preserve"/>
+            </w:r>
+            <w:proofErr w:type="spellStart"/>
+            <w:r>
+              <w:t/>
+            </w:r>
+            <w:proofErr w:type="spellEnd"/>
+            <w:r>
+              <w:t xml:space="preserve"/>
+            </w:r>
+          </w:p>
+        </w:tc>
+        <w:tc>
+          <w:tcPr>
+            <w:tcW w:w="2359" w:type="dxa"/>
+          </w:tcPr>
+          <w:p>
+            <w:r>
+              <w:rPr>
+                <w:rFonts w:hint="eastAsia"/>
+              </w:rPr>
+              <w:t xml:space="preserve">Ex. www.example.com 300 IN A 1.2.3.4</w:t>
+            </w:r>
+            <w:r>
+              <w:t/>
+            </w:r>
+          </w:p>
+        </w:tc>
+        <w:tc>
+          <w:tcPr>
+            <w:tcW w:w="1930" w:type="dxa"/>
+          </w:tcPr>
+          <w:p>
+            <w:r>
+              <w:rPr>
+                <w:rFonts w:hint="eastAsia"/>
+              </w:rPr>
+              <w:t>string</w:t>
             </w:r>
           </w:p>
         </w:tc>

</xml_diff>